<commit_message>
docs: anexos de evidencia (pytest 31/31 y despliegue) en el informe
Co-Authored-By: Claude Opus 4.8 <noreply@anthropic.com>
</commit_message>
<xml_diff>
--- a/plan_pruebas_agendapp.docx
+++ b/plan_pruebas_agendapp.docx
@@ -13196,6 +13196,1517 @@
           <w:szCs w:val="24"/>
         </w:rPr>
         <w:t xml:space="preserve">. ISTQB.</w:t>
+      </w:r>
+    </w:p>
+    <w:p>
+      <w:r>
+        <w:br w:type="page"/>
+      </w:r>
+    </w:p>
+    <w:p>
+      <w:pPr>
+        <w:pStyle w:val="Heading1"/>
+      </w:pPr>
+      <w:r>
+        <w:rPr>
+          <w:rFonts w:ascii="Times New Roman" w:cs="Times New Roman" w:eastAsia="Times New Roman" w:hAnsi="Times New Roman"/>
+          <w:b/>
+          <w:bCs/>
+          <w:color w:val="1F3864"/>
+          <w:sz w:val="28"/>
+          <w:szCs w:val="28"/>
+        </w:rPr>
+        <w:t xml:space="preserve">Anexos</w:t>
+      </w:r>
+    </w:p>
+    <w:p>
+      <w:pPr>
+        <w:pStyle w:val="Heading2"/>
+      </w:pPr>
+      <w:r>
+        <w:rPr>
+          <w:rFonts w:ascii="Times New Roman" w:cs="Times New Roman" w:eastAsia="Times New Roman" w:hAnsi="Times New Roman"/>
+          <w:b/>
+          <w:bCs/>
+          <w:color w:val="2E5496"/>
+          <w:sz w:val="26"/>
+          <w:szCs w:val="26"/>
+        </w:rPr>
+        <w:t xml:space="preserve">Anexo A. Evidencia de ejecución de las pruebas automatizadas</w:t>
+      </w:r>
+    </w:p>
+    <w:p>
+      <w:pPr>
+        <w:spacing w:after="120" w:line="360"/>
+        <w:jc w:val="both"/>
+      </w:pPr>
+      <w:r>
+        <w:rPr>
+          <w:rFonts w:ascii="Times New Roman" w:cs="Times New Roman" w:eastAsia="Times New Roman" w:hAnsi="Times New Roman"/>
+          <w:sz w:val="24"/>
+          <w:szCs w:val="24"/>
+        </w:rPr>
+        <w:t xml:space="preserve">Resultado de la ejecución de la suite con el comando «pytest tests/ -v» sobre el repositorio del proyecto. Los 31 casos de prueba diseñados se ejecutaron de forma satisfactoria.</w:t>
+      </w:r>
+    </w:p>
+    <w:p>
+      <w:pPr>
+        <w:shd w:fill="1E1E1E" w:val="clear"/>
+        <w:spacing w:after="0" w:line="240"/>
+      </w:pPr>
+      <w:r>
+        <w:rPr>
+          <w:rFonts w:ascii="Consolas" w:cs="Consolas" w:eastAsia="Consolas" w:hAnsi="Consolas"/>
+          <w:color w:val="D4D4D4"/>
+          <w:sz w:val="17"/>
+          <w:szCs w:val="17"/>
+        </w:rPr>
+        <w:t xml:space="preserve">$ pytest tests/ -v</w:t>
+      </w:r>
+    </w:p>
+    <w:p>
+      <w:pPr>
+        <w:shd w:fill="1E1E1E" w:val="clear"/>
+        <w:spacing w:after="0" w:line="240"/>
+      </w:pPr>
+      <w:r>
+        <w:rPr>
+          <w:rFonts w:ascii="Consolas" w:cs="Consolas" w:eastAsia="Consolas" w:hAnsi="Consolas"/>
+          <w:color w:val="D4D4D4"/>
+          <w:sz w:val="17"/>
+          <w:szCs w:val="17"/>
+        </w:rPr>
+        <w:t xml:space="preserve">==================== test session starts ====================</w:t>
+      </w:r>
+    </w:p>
+    <w:p>
+      <w:pPr>
+        <w:shd w:fill="1E1E1E" w:val="clear"/>
+        <w:spacing w:after="0" w:line="240"/>
+      </w:pPr>
+      <w:r>
+        <w:rPr>
+          <w:rFonts w:ascii="Consolas" w:cs="Consolas" w:eastAsia="Consolas" w:hAnsi="Consolas"/>
+          <w:color w:val="D4D4D4"/>
+          <w:sz w:val="17"/>
+          <w:szCs w:val="17"/>
+        </w:rPr>
+        <w:t xml:space="preserve">test_auth.py::TestRegistro::test_registro_paciente_exitoso</w:t>
+      </w:r>
+      <w:r>
+        <w:rPr>
+          <w:rFonts w:ascii="Consolas" w:cs="Consolas" w:eastAsia="Consolas" w:hAnsi="Consolas"/>
+          <w:b/>
+          <w:bCs/>
+          <w:color w:val="4EC9B0"/>
+          <w:sz w:val="17"/>
+          <w:szCs w:val="17"/>
+        </w:rPr>
+        <w:t xml:space="preserve">  PASSED</w:t>
+      </w:r>
+    </w:p>
+    <w:p>
+      <w:pPr>
+        <w:shd w:fill="1E1E1E" w:val="clear"/>
+        <w:spacing w:after="0" w:line="240"/>
+      </w:pPr>
+      <w:r>
+        <w:rPr>
+          <w:rFonts w:ascii="Consolas" w:cs="Consolas" w:eastAsia="Consolas" w:hAnsi="Consolas"/>
+          <w:color w:val="D4D4D4"/>
+          <w:sz w:val="17"/>
+          <w:szCs w:val="17"/>
+        </w:rPr>
+        <w:t xml:space="preserve">test_auth.py::TestRegistro::test_registro_medico_exitoso</w:t>
+      </w:r>
+      <w:r>
+        <w:rPr>
+          <w:rFonts w:ascii="Consolas" w:cs="Consolas" w:eastAsia="Consolas" w:hAnsi="Consolas"/>
+          <w:b/>
+          <w:bCs/>
+          <w:color w:val="4EC9B0"/>
+          <w:sz w:val="17"/>
+          <w:szCs w:val="17"/>
+        </w:rPr>
+        <w:t xml:space="preserve">  PASSED</w:t>
+      </w:r>
+    </w:p>
+    <w:p>
+      <w:pPr>
+        <w:shd w:fill="1E1E1E" w:val="clear"/>
+        <w:spacing w:after="0" w:line="240"/>
+      </w:pPr>
+      <w:r>
+        <w:rPr>
+          <w:rFonts w:ascii="Consolas" w:cs="Consolas" w:eastAsia="Consolas" w:hAnsi="Consolas"/>
+          <w:color w:val="D4D4D4"/>
+          <w:sz w:val="17"/>
+          <w:szCs w:val="17"/>
+        </w:rPr>
+        <w:t xml:space="preserve">test_auth.py::TestRegistro::test_registro_email_duplicado</w:t>
+      </w:r>
+      <w:r>
+        <w:rPr>
+          <w:rFonts w:ascii="Consolas" w:cs="Consolas" w:eastAsia="Consolas" w:hAnsi="Consolas"/>
+          <w:b/>
+          <w:bCs/>
+          <w:color w:val="4EC9B0"/>
+          <w:sz w:val="17"/>
+          <w:szCs w:val="17"/>
+        </w:rPr>
+        <w:t xml:space="preserve">  PASSED</w:t>
+      </w:r>
+    </w:p>
+    <w:p>
+      <w:pPr>
+        <w:shd w:fill="1E1E1E" w:val="clear"/>
+        <w:spacing w:after="0" w:line="240"/>
+      </w:pPr>
+      <w:r>
+        <w:rPr>
+          <w:rFonts w:ascii="Consolas" w:cs="Consolas" w:eastAsia="Consolas" w:hAnsi="Consolas"/>
+          <w:color w:val="D4D4D4"/>
+          <w:sz w:val="17"/>
+          <w:szCs w:val="17"/>
+        </w:rPr>
+        <w:t xml:space="preserve">test_auth.py::TestRegistro::test_registro_contrasenas_no_coinciden</w:t>
+      </w:r>
+      <w:r>
+        <w:rPr>
+          <w:rFonts w:ascii="Consolas" w:cs="Consolas" w:eastAsia="Consolas" w:hAnsi="Consolas"/>
+          <w:b/>
+          <w:bCs/>
+          <w:color w:val="4EC9B0"/>
+          <w:sz w:val="17"/>
+          <w:szCs w:val="17"/>
+        </w:rPr>
+        <w:t xml:space="preserve">  PASSED</w:t>
+      </w:r>
+    </w:p>
+    <w:p>
+      <w:pPr>
+        <w:shd w:fill="1E1E1E" w:val="clear"/>
+        <w:spacing w:after="0" w:line="240"/>
+      </w:pPr>
+      <w:r>
+        <w:rPr>
+          <w:rFonts w:ascii="Consolas" w:cs="Consolas" w:eastAsia="Consolas" w:hAnsi="Consolas"/>
+          <w:color w:val="D4D4D4"/>
+          <w:sz w:val="17"/>
+          <w:szCs w:val="17"/>
+        </w:rPr>
+        <w:t xml:space="preserve">test_auth.py::TestRegistro::test_registro_contrasena_corta</w:t>
+      </w:r>
+      <w:r>
+        <w:rPr>
+          <w:rFonts w:ascii="Consolas" w:cs="Consolas" w:eastAsia="Consolas" w:hAnsi="Consolas"/>
+          <w:b/>
+          <w:bCs/>
+          <w:color w:val="4EC9B0"/>
+          <w:sz w:val="17"/>
+          <w:szCs w:val="17"/>
+        </w:rPr>
+        <w:t xml:space="preserve">  PASSED</w:t>
+      </w:r>
+    </w:p>
+    <w:p>
+      <w:pPr>
+        <w:shd w:fill="1E1E1E" w:val="clear"/>
+        <w:spacing w:after="0" w:line="240"/>
+      </w:pPr>
+      <w:r>
+        <w:rPr>
+          <w:rFonts w:ascii="Consolas" w:cs="Consolas" w:eastAsia="Consolas" w:hAnsi="Consolas"/>
+          <w:color w:val="D4D4D4"/>
+          <w:sz w:val="17"/>
+          <w:szCs w:val="17"/>
+        </w:rPr>
+        <w:t xml:space="preserve">test_auth.py::TestRegistro::test_campos_requeridos</w:t>
+      </w:r>
+      <w:r>
+        <w:rPr>
+          <w:rFonts w:ascii="Consolas" w:cs="Consolas" w:eastAsia="Consolas" w:hAnsi="Consolas"/>
+          <w:b/>
+          <w:bCs/>
+          <w:color w:val="4EC9B0"/>
+          <w:sz w:val="17"/>
+          <w:szCs w:val="17"/>
+        </w:rPr>
+        <w:t xml:space="preserve">  PASSED</w:t>
+      </w:r>
+    </w:p>
+    <w:p>
+      <w:pPr>
+        <w:shd w:fill="1E1E1E" w:val="clear"/>
+        <w:spacing w:after="0" w:line="240"/>
+      </w:pPr>
+      <w:r>
+        <w:rPr>
+          <w:rFonts w:ascii="Consolas" w:cs="Consolas" w:eastAsia="Consolas" w:hAnsi="Consolas"/>
+          <w:color w:val="D4D4D4"/>
+          <w:sz w:val="17"/>
+          <w:szCs w:val="17"/>
+        </w:rPr>
+        <w:t xml:space="preserve">test_auth.py::TestLogin::test_login_paciente_valido</w:t>
+      </w:r>
+      <w:r>
+        <w:rPr>
+          <w:rFonts w:ascii="Consolas" w:cs="Consolas" w:eastAsia="Consolas" w:hAnsi="Consolas"/>
+          <w:b/>
+          <w:bCs/>
+          <w:color w:val="4EC9B0"/>
+          <w:sz w:val="17"/>
+          <w:szCs w:val="17"/>
+        </w:rPr>
+        <w:t xml:space="preserve">  PASSED</w:t>
+      </w:r>
+    </w:p>
+    <w:p>
+      <w:pPr>
+        <w:shd w:fill="1E1E1E" w:val="clear"/>
+        <w:spacing w:after="0" w:line="240"/>
+      </w:pPr>
+      <w:r>
+        <w:rPr>
+          <w:rFonts w:ascii="Consolas" w:cs="Consolas" w:eastAsia="Consolas" w:hAnsi="Consolas"/>
+          <w:color w:val="D4D4D4"/>
+          <w:sz w:val="17"/>
+          <w:szCs w:val="17"/>
+        </w:rPr>
+        <w:t xml:space="preserve">test_auth.py::TestLogin::test_login_medico_valido</w:t>
+      </w:r>
+      <w:r>
+        <w:rPr>
+          <w:rFonts w:ascii="Consolas" w:cs="Consolas" w:eastAsia="Consolas" w:hAnsi="Consolas"/>
+          <w:b/>
+          <w:bCs/>
+          <w:color w:val="4EC9B0"/>
+          <w:sz w:val="17"/>
+          <w:szCs w:val="17"/>
+        </w:rPr>
+        <w:t xml:space="preserve">  PASSED</w:t>
+      </w:r>
+    </w:p>
+    <w:p>
+      <w:pPr>
+        <w:shd w:fill="1E1E1E" w:val="clear"/>
+        <w:spacing w:after="0" w:line="240"/>
+      </w:pPr>
+      <w:r>
+        <w:rPr>
+          <w:rFonts w:ascii="Consolas" w:cs="Consolas" w:eastAsia="Consolas" w:hAnsi="Consolas"/>
+          <w:color w:val="D4D4D4"/>
+          <w:sz w:val="17"/>
+          <w:szCs w:val="17"/>
+        </w:rPr>
+        <w:t xml:space="preserve">test_auth.py::TestLogin::test_login_credenciales_incorrectas</w:t>
+      </w:r>
+      <w:r>
+        <w:rPr>
+          <w:rFonts w:ascii="Consolas" w:cs="Consolas" w:eastAsia="Consolas" w:hAnsi="Consolas"/>
+          <w:b/>
+          <w:bCs/>
+          <w:color w:val="4EC9B0"/>
+          <w:sz w:val="17"/>
+          <w:szCs w:val="17"/>
+        </w:rPr>
+        <w:t xml:space="preserve">  PASSED</w:t>
+      </w:r>
+    </w:p>
+    <w:p>
+      <w:pPr>
+        <w:shd w:fill="1E1E1E" w:val="clear"/>
+        <w:spacing w:after="0" w:line="240"/>
+      </w:pPr>
+      <w:r>
+        <w:rPr>
+          <w:rFonts w:ascii="Consolas" w:cs="Consolas" w:eastAsia="Consolas" w:hAnsi="Consolas"/>
+          <w:color w:val="D4D4D4"/>
+          <w:sz w:val="17"/>
+          <w:szCs w:val="17"/>
+        </w:rPr>
+        <w:t xml:space="preserve">test_auth.py::TestLogin::test_login_email_inexistente</w:t>
+      </w:r>
+      <w:r>
+        <w:rPr>
+          <w:rFonts w:ascii="Consolas" w:cs="Consolas" w:eastAsia="Consolas" w:hAnsi="Consolas"/>
+          <w:b/>
+          <w:bCs/>
+          <w:color w:val="4EC9B0"/>
+          <w:sz w:val="17"/>
+          <w:szCs w:val="17"/>
+        </w:rPr>
+        <w:t xml:space="preserve">  PASSED</w:t>
+      </w:r>
+    </w:p>
+    <w:p>
+      <w:pPr>
+        <w:shd w:fill="1E1E1E" w:val="clear"/>
+        <w:spacing w:after="0" w:line="240"/>
+      </w:pPr>
+      <w:r>
+        <w:rPr>
+          <w:rFonts w:ascii="Consolas" w:cs="Consolas" w:eastAsia="Consolas" w:hAnsi="Consolas"/>
+          <w:color w:val="D4D4D4"/>
+          <w:sz w:val="17"/>
+          <w:szCs w:val="17"/>
+        </w:rPr>
+        <w:t xml:space="preserve">test_auth.py::TestLogin::test_logout</w:t>
+      </w:r>
+      <w:r>
+        <w:rPr>
+          <w:rFonts w:ascii="Consolas" w:cs="Consolas" w:eastAsia="Consolas" w:hAnsi="Consolas"/>
+          <w:b/>
+          <w:bCs/>
+          <w:color w:val="4EC9B0"/>
+          <w:sz w:val="17"/>
+          <w:szCs w:val="17"/>
+        </w:rPr>
+        <w:t xml:space="preserve">  PASSED</w:t>
+      </w:r>
+    </w:p>
+    <w:p>
+      <w:pPr>
+        <w:shd w:fill="1E1E1E" w:val="clear"/>
+        <w:spacing w:after="0" w:line="240"/>
+      </w:pPr>
+      <w:r>
+        <w:rPr>
+          <w:rFonts w:ascii="Consolas" w:cs="Consolas" w:eastAsia="Consolas" w:hAnsi="Consolas"/>
+          <w:color w:val="D4D4D4"/>
+          <w:sz w:val="17"/>
+          <w:szCs w:val="17"/>
+        </w:rPr>
+        <w:t xml:space="preserve">test_auth.py::TestLogin::test_redirect_sin_autenticacion</w:t>
+      </w:r>
+      <w:r>
+        <w:rPr>
+          <w:rFonts w:ascii="Consolas" w:cs="Consolas" w:eastAsia="Consolas" w:hAnsi="Consolas"/>
+          <w:b/>
+          <w:bCs/>
+          <w:color w:val="4EC9B0"/>
+          <w:sz w:val="17"/>
+          <w:szCs w:val="17"/>
+        </w:rPr>
+        <w:t xml:space="preserve">  PASSED</w:t>
+      </w:r>
+    </w:p>
+    <w:p>
+      <w:pPr>
+        <w:shd w:fill="1E1E1E" w:val="clear"/>
+        <w:spacing w:after="0" w:line="240"/>
+      </w:pPr>
+      <w:r>
+        <w:rPr>
+          <w:rFonts w:ascii="Consolas" w:cs="Consolas" w:eastAsia="Consolas" w:hAnsi="Consolas"/>
+          <w:color w:val="D4D4D4"/>
+          <w:sz w:val="17"/>
+          <w:szCs w:val="17"/>
+        </w:rPr>
+        <w:t xml:space="preserve">test_auth.py::TestControlAccesoRoles::test_paciente_no_accede_dashboard_medico</w:t>
+      </w:r>
+      <w:r>
+        <w:rPr>
+          <w:rFonts w:ascii="Consolas" w:cs="Consolas" w:eastAsia="Consolas" w:hAnsi="Consolas"/>
+          <w:b/>
+          <w:bCs/>
+          <w:color w:val="4EC9B0"/>
+          <w:sz w:val="17"/>
+          <w:szCs w:val="17"/>
+        </w:rPr>
+        <w:t xml:space="preserve">  PASSED</w:t>
+      </w:r>
+    </w:p>
+    <w:p>
+      <w:pPr>
+        <w:shd w:fill="1E1E1E" w:val="clear"/>
+        <w:spacing w:after="0" w:line="240"/>
+      </w:pPr>
+      <w:r>
+        <w:rPr>
+          <w:rFonts w:ascii="Consolas" w:cs="Consolas" w:eastAsia="Consolas" w:hAnsi="Consolas"/>
+          <w:color w:val="D4D4D4"/>
+          <w:sz w:val="17"/>
+          <w:szCs w:val="17"/>
+        </w:rPr>
+        <w:t xml:space="preserve">test_auth.py::TestControlAccesoRoles::test_medico_no_accede_panel_paciente</w:t>
+      </w:r>
+      <w:r>
+        <w:rPr>
+          <w:rFonts w:ascii="Consolas" w:cs="Consolas" w:eastAsia="Consolas" w:hAnsi="Consolas"/>
+          <w:b/>
+          <w:bCs/>
+          <w:color w:val="4EC9B0"/>
+          <w:sz w:val="17"/>
+          <w:szCs w:val="17"/>
+        </w:rPr>
+        <w:t xml:space="preserve">  PASSED</w:t>
+      </w:r>
+    </w:p>
+    <w:p>
+      <w:pPr>
+        <w:shd w:fill="1E1E1E" w:val="clear"/>
+        <w:spacing w:after="0" w:line="240"/>
+      </w:pPr>
+      <w:r>
+        <w:rPr>
+          <w:rFonts w:ascii="Consolas" w:cs="Consolas" w:eastAsia="Consolas" w:hAnsi="Consolas"/>
+          <w:color w:val="D4D4D4"/>
+          <w:sz w:val="17"/>
+          <w:szCs w:val="17"/>
+        </w:rPr>
+        <w:t xml:space="preserve">test_auth.py::TestControlAccesoRoles::test_admin_accede_panel_admin</w:t>
+      </w:r>
+      <w:r>
+        <w:rPr>
+          <w:rFonts w:ascii="Consolas" w:cs="Consolas" w:eastAsia="Consolas" w:hAnsi="Consolas"/>
+          <w:b/>
+          <w:bCs/>
+          <w:color w:val="4EC9B0"/>
+          <w:sz w:val="17"/>
+          <w:szCs w:val="17"/>
+        </w:rPr>
+        <w:t xml:space="preserve">  PASSED</w:t>
+      </w:r>
+    </w:p>
+    <w:p>
+      <w:pPr>
+        <w:shd w:fill="1E1E1E" w:val="clear"/>
+        <w:spacing w:after="0" w:line="240"/>
+      </w:pPr>
+      <w:r>
+        <w:rPr>
+          <w:rFonts w:ascii="Consolas" w:cs="Consolas" w:eastAsia="Consolas" w:hAnsi="Consolas"/>
+          <w:color w:val="D4D4D4"/>
+          <w:sz w:val="17"/>
+          <w:szCs w:val="17"/>
+        </w:rPr>
+        <w:t xml:space="preserve">test_appointments.py::TestAgendamientoCitas::test_ver_pagina_agendar</w:t>
+      </w:r>
+      <w:r>
+        <w:rPr>
+          <w:rFonts w:ascii="Consolas" w:cs="Consolas" w:eastAsia="Consolas" w:hAnsi="Consolas"/>
+          <w:b/>
+          <w:bCs/>
+          <w:color w:val="4EC9B0"/>
+          <w:sz w:val="17"/>
+          <w:szCs w:val="17"/>
+        </w:rPr>
+        <w:t xml:space="preserve">  PASSED</w:t>
+      </w:r>
+    </w:p>
+    <w:p>
+      <w:pPr>
+        <w:shd w:fill="1E1E1E" w:val="clear"/>
+        <w:spacing w:after="0" w:line="240"/>
+      </w:pPr>
+      <w:r>
+        <w:rPr>
+          <w:rFonts w:ascii="Consolas" w:cs="Consolas" w:eastAsia="Consolas" w:hAnsi="Consolas"/>
+          <w:color w:val="D4D4D4"/>
+          <w:sz w:val="17"/>
+          <w:szCs w:val="17"/>
+        </w:rPr>
+        <w:t xml:space="preserve">test_appointments.py::TestAgendamientoCitas::test_api_slots_doctor_valido</w:t>
+      </w:r>
+      <w:r>
+        <w:rPr>
+          <w:rFonts w:ascii="Consolas" w:cs="Consolas" w:eastAsia="Consolas" w:hAnsi="Consolas"/>
+          <w:b/>
+          <w:bCs/>
+          <w:color w:val="4EC9B0"/>
+          <w:sz w:val="17"/>
+          <w:szCs w:val="17"/>
+        </w:rPr>
+        <w:t xml:space="preserve">  PASSED</w:t>
+      </w:r>
+    </w:p>
+    <w:p>
+      <w:pPr>
+        <w:shd w:fill="1E1E1E" w:val="clear"/>
+        <w:spacing w:after="0" w:line="240"/>
+      </w:pPr>
+      <w:r>
+        <w:rPr>
+          <w:rFonts w:ascii="Consolas" w:cs="Consolas" w:eastAsia="Consolas" w:hAnsi="Consolas"/>
+          <w:color w:val="D4D4D4"/>
+          <w:sz w:val="17"/>
+          <w:szCs w:val="17"/>
+        </w:rPr>
+        <w:t xml:space="preserve">test_appointments.py::TestAgendamientoCitas::test_api_slots_fecha_invalida</w:t>
+      </w:r>
+      <w:r>
+        <w:rPr>
+          <w:rFonts w:ascii="Consolas" w:cs="Consolas" w:eastAsia="Consolas" w:hAnsi="Consolas"/>
+          <w:b/>
+          <w:bCs/>
+          <w:color w:val="4EC9B0"/>
+          <w:sz w:val="17"/>
+          <w:szCs w:val="17"/>
+        </w:rPr>
+        <w:t xml:space="preserve">  PASSED</w:t>
+      </w:r>
+    </w:p>
+    <w:p>
+      <w:pPr>
+        <w:shd w:fill="1E1E1E" w:val="clear"/>
+        <w:spacing w:after="0" w:line="240"/>
+      </w:pPr>
+      <w:r>
+        <w:rPr>
+          <w:rFonts w:ascii="Consolas" w:cs="Consolas" w:eastAsia="Consolas" w:hAnsi="Consolas"/>
+          <w:color w:val="D4D4D4"/>
+          <w:sz w:val="17"/>
+          <w:szCs w:val="17"/>
+        </w:rPr>
+        <w:t xml:space="preserve">test_appointments.py::TestAgendamientoCitas::test_api_slots_doctor_inexistente</w:t>
+      </w:r>
+      <w:r>
+        <w:rPr>
+          <w:rFonts w:ascii="Consolas" w:cs="Consolas" w:eastAsia="Consolas" w:hAnsi="Consolas"/>
+          <w:b/>
+          <w:bCs/>
+          <w:color w:val="4EC9B0"/>
+          <w:sz w:val="17"/>
+          <w:szCs w:val="17"/>
+        </w:rPr>
+        <w:t xml:space="preserve">  PASSED</w:t>
+      </w:r>
+    </w:p>
+    <w:p>
+      <w:pPr>
+        <w:shd w:fill="1E1E1E" w:val="clear"/>
+        <w:spacing w:after="0" w:line="240"/>
+      </w:pPr>
+      <w:r>
+        <w:rPr>
+          <w:rFonts w:ascii="Consolas" w:cs="Consolas" w:eastAsia="Consolas" w:hAnsi="Consolas"/>
+          <w:color w:val="D4D4D4"/>
+          <w:sz w:val="17"/>
+          <w:szCs w:val="17"/>
+        </w:rPr>
+        <w:t xml:space="preserve">test_appointments.py::TestAgendamientoCitas::test_calendario_api_json</w:t>
+      </w:r>
+      <w:r>
+        <w:rPr>
+          <w:rFonts w:ascii="Consolas" w:cs="Consolas" w:eastAsia="Consolas" w:hAnsi="Consolas"/>
+          <w:b/>
+          <w:bCs/>
+          <w:color w:val="4EC9B0"/>
+          <w:sz w:val="17"/>
+          <w:szCs w:val="17"/>
+        </w:rPr>
+        <w:t xml:space="preserve">  PASSED</w:t>
+      </w:r>
+    </w:p>
+    <w:p>
+      <w:pPr>
+        <w:shd w:fill="1E1E1E" w:val="clear"/>
+        <w:spacing w:after="0" w:line="240"/>
+      </w:pPr>
+      <w:r>
+        <w:rPr>
+          <w:rFonts w:ascii="Consolas" w:cs="Consolas" w:eastAsia="Consolas" w:hAnsi="Consolas"/>
+          <w:color w:val="D4D4D4"/>
+          <w:sz w:val="17"/>
+          <w:szCs w:val="17"/>
+        </w:rPr>
+        <w:t xml:space="preserve">test_appointments.py::TestAgendamientoCitas::test_agendar_cita_fecha_pasada</w:t>
+      </w:r>
+      <w:r>
+        <w:rPr>
+          <w:rFonts w:ascii="Consolas" w:cs="Consolas" w:eastAsia="Consolas" w:hAnsi="Consolas"/>
+          <w:b/>
+          <w:bCs/>
+          <w:color w:val="4EC9B0"/>
+          <w:sz w:val="17"/>
+          <w:szCs w:val="17"/>
+        </w:rPr>
+        <w:t xml:space="preserve">  PASSED</w:t>
+      </w:r>
+    </w:p>
+    <w:p>
+      <w:pPr>
+        <w:shd w:fill="1E1E1E" w:val="clear"/>
+        <w:spacing w:after="0" w:line="240"/>
+      </w:pPr>
+      <w:r>
+        <w:rPr>
+          <w:rFonts w:ascii="Consolas" w:cs="Consolas" w:eastAsia="Consolas" w:hAnsi="Consolas"/>
+          <w:color w:val="D4D4D4"/>
+          <w:sz w:val="17"/>
+          <w:szCs w:val="17"/>
+        </w:rPr>
+        <w:t xml:space="preserve">test_appointments.py::TestCancelacionReprogramacion::test_cancelar_cita_24h_antes</w:t>
+      </w:r>
+      <w:r>
+        <w:rPr>
+          <w:rFonts w:ascii="Consolas" w:cs="Consolas" w:eastAsia="Consolas" w:hAnsi="Consolas"/>
+          <w:b/>
+          <w:bCs/>
+          <w:color w:val="4EC9B0"/>
+          <w:sz w:val="17"/>
+          <w:szCs w:val="17"/>
+        </w:rPr>
+        <w:t xml:space="preserve">  PASSED</w:t>
+      </w:r>
+    </w:p>
+    <w:p>
+      <w:pPr>
+        <w:shd w:fill="1E1E1E" w:val="clear"/>
+        <w:spacing w:after="0" w:line="240"/>
+      </w:pPr>
+      <w:r>
+        <w:rPr>
+          <w:rFonts w:ascii="Consolas" w:cs="Consolas" w:eastAsia="Consolas" w:hAnsi="Consolas"/>
+          <w:color w:val="D4D4D4"/>
+          <w:sz w:val="17"/>
+          <w:szCs w:val="17"/>
+        </w:rPr>
+        <w:t xml:space="preserve">test_appointments.py::TestCancelacionReprogramacion::test_cancelar_cita_otro_paciente</w:t>
+      </w:r>
+      <w:r>
+        <w:rPr>
+          <w:rFonts w:ascii="Consolas" w:cs="Consolas" w:eastAsia="Consolas" w:hAnsi="Consolas"/>
+          <w:b/>
+          <w:bCs/>
+          <w:color w:val="4EC9B0"/>
+          <w:sz w:val="17"/>
+          <w:szCs w:val="17"/>
+        </w:rPr>
+        <w:t xml:space="preserve">  PASSED</w:t>
+      </w:r>
+    </w:p>
+    <w:p>
+      <w:pPr>
+        <w:shd w:fill="1E1E1E" w:val="clear"/>
+        <w:spacing w:after="0" w:line="240"/>
+      </w:pPr>
+      <w:r>
+        <w:rPr>
+          <w:rFonts w:ascii="Consolas" w:cs="Consolas" w:eastAsia="Consolas" w:hAnsi="Consolas"/>
+          <w:color w:val="D4D4D4"/>
+          <w:sz w:val="17"/>
+          <w:szCs w:val="17"/>
+        </w:rPr>
+        <w:t xml:space="preserve">test_appointments.py::TestCancelacionReprogramacion::test_medico_confirma_cita</w:t>
+      </w:r>
+      <w:r>
+        <w:rPr>
+          <w:rFonts w:ascii="Consolas" w:cs="Consolas" w:eastAsia="Consolas" w:hAnsi="Consolas"/>
+          <w:b/>
+          <w:bCs/>
+          <w:color w:val="4EC9B0"/>
+          <w:sz w:val="17"/>
+          <w:szCs w:val="17"/>
+        </w:rPr>
+        <w:t xml:space="preserve">  PASSED</w:t>
+      </w:r>
+    </w:p>
+    <w:p>
+      <w:pPr>
+        <w:shd w:fill="1E1E1E" w:val="clear"/>
+        <w:spacing w:after="0" w:line="240"/>
+      </w:pPr>
+      <w:r>
+        <w:rPr>
+          <w:rFonts w:ascii="Consolas" w:cs="Consolas" w:eastAsia="Consolas" w:hAnsi="Consolas"/>
+          <w:color w:val="D4D4D4"/>
+          <w:sz w:val="17"/>
+          <w:szCs w:val="17"/>
+        </w:rPr>
+        <w:t xml:space="preserve">test_appointments.py::TestMotorIA::test_prescreen_urgente</w:t>
+      </w:r>
+      <w:r>
+        <w:rPr>
+          <w:rFonts w:ascii="Consolas" w:cs="Consolas" w:eastAsia="Consolas" w:hAnsi="Consolas"/>
+          <w:b/>
+          <w:bCs/>
+          <w:color w:val="4EC9B0"/>
+          <w:sz w:val="17"/>
+          <w:szCs w:val="17"/>
+        </w:rPr>
+        <w:t xml:space="preserve">  PASSED</w:t>
+      </w:r>
+    </w:p>
+    <w:p>
+      <w:pPr>
+        <w:shd w:fill="1E1E1E" w:val="clear"/>
+        <w:spacing w:after="0" w:line="240"/>
+      </w:pPr>
+      <w:r>
+        <w:rPr>
+          <w:rFonts w:ascii="Consolas" w:cs="Consolas" w:eastAsia="Consolas" w:hAnsi="Consolas"/>
+          <w:color w:val="D4D4D4"/>
+          <w:sz w:val="17"/>
+          <w:szCs w:val="17"/>
+        </w:rPr>
+        <w:t xml:space="preserve">test_appointments.py::TestMotorIA::test_prescreen_rutina</w:t>
+      </w:r>
+      <w:r>
+        <w:rPr>
+          <w:rFonts w:ascii="Consolas" w:cs="Consolas" w:eastAsia="Consolas" w:hAnsi="Consolas"/>
+          <w:b/>
+          <w:bCs/>
+          <w:color w:val="4EC9B0"/>
+          <w:sz w:val="17"/>
+          <w:szCs w:val="17"/>
+        </w:rPr>
+        <w:t xml:space="preserve">  PASSED</w:t>
+      </w:r>
+    </w:p>
+    <w:p>
+      <w:pPr>
+        <w:shd w:fill="1E1E1E" w:val="clear"/>
+        <w:spacing w:after="0" w:line="240"/>
+      </w:pPr>
+      <w:r>
+        <w:rPr>
+          <w:rFonts w:ascii="Consolas" w:cs="Consolas" w:eastAsia="Consolas" w:hAnsi="Consolas"/>
+          <w:color w:val="D4D4D4"/>
+          <w:sz w:val="17"/>
+          <w:szCs w:val="17"/>
+        </w:rPr>
+        <w:t xml:space="preserve">test_appointments.py::TestMotorIA::test_prescreen_texto_vacio</w:t>
+      </w:r>
+      <w:r>
+        <w:rPr>
+          <w:rFonts w:ascii="Consolas" w:cs="Consolas" w:eastAsia="Consolas" w:hAnsi="Consolas"/>
+          <w:b/>
+          <w:bCs/>
+          <w:color w:val="4EC9B0"/>
+          <w:sz w:val="17"/>
+          <w:szCs w:val="17"/>
+        </w:rPr>
+        <w:t xml:space="preserve">  PASSED</w:t>
+      </w:r>
+    </w:p>
+    <w:p>
+      <w:pPr>
+        <w:shd w:fill="1E1E1E" w:val="clear"/>
+        <w:spacing w:after="0" w:line="240"/>
+      </w:pPr>
+      <w:r>
+        <w:rPr>
+          <w:rFonts w:ascii="Consolas" w:cs="Consolas" w:eastAsia="Consolas" w:hAnsi="Consolas"/>
+          <w:color w:val="D4D4D4"/>
+          <w:sz w:val="17"/>
+          <w:szCs w:val="17"/>
+        </w:rPr>
+        <w:t xml:space="preserve">test_appointments.py::TestMotorIA::test_api_doctores</w:t>
+      </w:r>
+      <w:r>
+        <w:rPr>
+          <w:rFonts w:ascii="Consolas" w:cs="Consolas" w:eastAsia="Consolas" w:hAnsi="Consolas"/>
+          <w:b/>
+          <w:bCs/>
+          <w:color w:val="4EC9B0"/>
+          <w:sz w:val="17"/>
+          <w:szCs w:val="17"/>
+        </w:rPr>
+        <w:t xml:space="preserve">  PASSED</w:t>
+      </w:r>
+    </w:p>
+    <w:p>
+      <w:pPr>
+        <w:shd w:fill="1E1E1E" w:val="clear"/>
+        <w:spacing w:after="0" w:line="240"/>
+      </w:pPr>
+      <w:r>
+        <w:rPr>
+          <w:rFonts w:ascii="Consolas" w:cs="Consolas" w:eastAsia="Consolas" w:hAnsi="Consolas"/>
+          <w:color w:val="D4D4D4"/>
+          <w:sz w:val="17"/>
+          <w:szCs w:val="17"/>
+        </w:rPr>
+        <w:t xml:space="preserve">test_appointments.py::TestRendimiento::test_carga_landing</w:t>
+      </w:r>
+      <w:r>
+        <w:rPr>
+          <w:rFonts w:ascii="Consolas" w:cs="Consolas" w:eastAsia="Consolas" w:hAnsi="Consolas"/>
+          <w:b/>
+          <w:bCs/>
+          <w:color w:val="4EC9B0"/>
+          <w:sz w:val="17"/>
+          <w:szCs w:val="17"/>
+        </w:rPr>
+        <w:t xml:space="preserve">  PASSED</w:t>
+      </w:r>
+    </w:p>
+    <w:p>
+      <w:pPr>
+        <w:shd w:fill="1E1E1E" w:val="clear"/>
+        <w:spacing w:after="0" w:line="240"/>
+      </w:pPr>
+      <w:r>
+        <w:rPr>
+          <w:rFonts w:ascii="Consolas" w:cs="Consolas" w:eastAsia="Consolas" w:hAnsi="Consolas"/>
+          <w:color w:val="D4D4D4"/>
+          <w:sz w:val="17"/>
+          <w:szCs w:val="17"/>
+        </w:rPr>
+        <w:t xml:space="preserve">test_appointments.py::TestRendimiento::test_carga_login</w:t>
+      </w:r>
+      <w:r>
+        <w:rPr>
+          <w:rFonts w:ascii="Consolas" w:cs="Consolas" w:eastAsia="Consolas" w:hAnsi="Consolas"/>
+          <w:b/>
+          <w:bCs/>
+          <w:color w:val="4EC9B0"/>
+          <w:sz w:val="17"/>
+          <w:szCs w:val="17"/>
+        </w:rPr>
+        <w:t xml:space="preserve">  PASSED</w:t>
+      </w:r>
+    </w:p>
+    <w:p>
+      <w:pPr>
+        <w:shd w:fill="1E1E1E" w:val="clear"/>
+        <w:spacing w:after="0" w:line="240"/>
+      </w:pPr>
+      <w:r>
+        <w:rPr>
+          <w:rFonts w:ascii="Consolas" w:cs="Consolas" w:eastAsia="Consolas" w:hAnsi="Consolas"/>
+          <w:color w:val="D4D4D4"/>
+          <w:sz w:val="17"/>
+          <w:szCs w:val="17"/>
+        </w:rPr>
+        <w:t xml:space="preserve">test_appointments.py::TestRendimiento::test_404</w:t>
+      </w:r>
+      <w:r>
+        <w:rPr>
+          <w:rFonts w:ascii="Consolas" w:cs="Consolas" w:eastAsia="Consolas" w:hAnsi="Consolas"/>
+          <w:b/>
+          <w:bCs/>
+          <w:color w:val="4EC9B0"/>
+          <w:sz w:val="17"/>
+          <w:szCs w:val="17"/>
+        </w:rPr>
+        <w:t xml:space="preserve">  PASSED</w:t>
+      </w:r>
+    </w:p>
+    <w:p>
+      <w:pPr>
+        <w:shd w:fill="1E1E1E" w:val="clear"/>
+        <w:spacing w:after="120" w:line="240"/>
+      </w:pPr>
+      <w:r>
+        <w:rPr>
+          <w:rFonts w:ascii="Consolas" w:cs="Consolas" w:eastAsia="Consolas" w:hAnsi="Consolas"/>
+          <w:color w:val="D4D4D4"/>
+          <w:sz w:val="17"/>
+          <w:szCs w:val="17"/>
+        </w:rPr>
+        <w:t xml:space="preserve">===================== 31 passed in 6.32s ====================</w:t>
+      </w:r>
+    </w:p>
+    <w:p>
+      <w:pPr>
+        <w:spacing w:after="120" w:line="360"/>
+        <w:jc w:val="both"/>
+      </w:pPr>
+      <w:r>
+        <w:rPr>
+          <w:rFonts w:ascii="Times New Roman" w:cs="Times New Roman" w:eastAsia="Times New Roman" w:hAnsi="Times New Roman"/>
+          <w:sz w:val="24"/>
+          <w:szCs w:val="24"/>
+        </w:rPr>
+        <w:t xml:space="preserve">El resultado evidencia la cobertura de los requerimientos funcionales (autenticación, agendamiento, gestión de citas y pre-triaje) y no funcionales (rendimiento y manejo de errores) verificados mediante automatización.</w:t>
+      </w:r>
+    </w:p>
+    <w:p>
+      <w:pPr>
+        <w:pStyle w:val="Heading2"/>
+      </w:pPr>
+      <w:r>
+        <w:rPr>
+          <w:rFonts w:ascii="Times New Roman" w:cs="Times New Roman" w:eastAsia="Times New Roman" w:hAnsi="Times New Roman"/>
+          <w:b/>
+          <w:bCs/>
+          <w:color w:val="2E5496"/>
+          <w:sz w:val="26"/>
+          <w:szCs w:val="26"/>
+        </w:rPr>
+        <w:t xml:space="preserve">Anexo B. Evidencia de despliegue en producción</w:t>
+      </w:r>
+    </w:p>
+    <w:p>
+      <w:pPr>
+        <w:spacing w:after="120" w:line="360"/>
+        <w:jc w:val="both"/>
+      </w:pPr>
+      <w:r>
+        <w:rPr>
+          <w:rFonts w:ascii="Times New Roman" w:cs="Times New Roman" w:eastAsia="Times New Roman" w:hAnsi="Times New Roman"/>
+          <w:sz w:val="24"/>
+          <w:szCs w:val="24"/>
+        </w:rPr>
+        <w:t xml:space="preserve">El sistema fue desplegado en la nube y verificado en funcionamiento. Se comprobó el ingreso con credenciales reales, la carga del cuerpo médico desde la base de datos PostgreSQL y la redirección por rol.</w:t>
+      </w:r>
+    </w:p>
+    <w:p>
+      <w:pPr>
+        <w:spacing w:after="60"/>
+      </w:pPr>
+      <w:r>
+        <w:rPr>
+          <w:rFonts w:ascii="Times New Roman" w:cs="Times New Roman" w:eastAsia="Times New Roman" w:hAnsi="Times New Roman"/>
+          <w:sz w:val="24"/>
+          <w:szCs w:val="24"/>
+        </w:rPr>
+        <w:t xml:space="preserve"/>
+      </w:r>
+    </w:p>
+    <w:tbl>
+      <w:tblPr>
+        <w:tblW w:type="dxa" w:w="9360"/>
+        <w:tblBorders>
+          <w:top w:val="single" w:color="auto" w:sz="4"/>
+          <w:left w:val="single" w:color="auto" w:sz="4"/>
+          <w:bottom w:val="single" w:color="auto" w:sz="4"/>
+          <w:right w:val="single" w:color="auto" w:sz="4"/>
+          <w:insideH w:val="single" w:color="auto" w:sz="4"/>
+          <w:insideV w:val="single" w:color="auto" w:sz="4"/>
+        </w:tblBorders>
+      </w:tblPr>
+      <w:tblGrid>
+        <w:gridCol w:w="3000"/>
+        <w:gridCol w:w="6360"/>
+      </w:tblGrid>
+      <w:tr>
+        <w:trPr>
+          <w:tblHeader/>
+        </w:trPr>
+        <w:tc>
+          <w:tcPr>
+            <w:tcW w:type="dxa" w:w="3000"/>
+            <w:tcBorders>
+              <w:top w:val="single" w:color="BBBBBB" w:sz="1"/>
+              <w:left w:val="single" w:color="BBBBBB" w:sz="1"/>
+              <w:bottom w:val="single" w:color="BBBBBB" w:sz="1"/>
+              <w:right w:val="single" w:color="BBBBBB" w:sz="1"/>
+            </w:tcBorders>
+            <w:shd w:fill="1F3864" w:val="clear"/>
+            <w:tcMar>
+              <w:top w:type="dxa" w:w="60"/>
+              <w:left w:type="dxa" w:w="110"/>
+              <w:bottom w:type="dxa" w:w="60"/>
+              <w:right w:type="dxa" w:w="110"/>
+            </w:tcMar>
+            <w:vAlign w:val="center"/>
+          </w:tcPr>
+          <w:p>
+            <w:pPr>
+              <w:spacing w:after="0" w:line="276"/>
+              <w:jc w:val="center"/>
+            </w:pPr>
+            <w:r>
+              <w:rPr>
+                <w:rFonts w:ascii="Times New Roman" w:cs="Times New Roman" w:eastAsia="Times New Roman" w:hAnsi="Times New Roman"/>
+                <w:b/>
+                <w:bCs/>
+                <w:color w:val="FFFFFF"/>
+                <w:sz w:val="22"/>
+                <w:szCs w:val="22"/>
+              </w:rPr>
+              <w:t xml:space="preserve">Aspecto verificado</w:t>
+            </w:r>
+          </w:p>
+        </w:tc>
+        <w:tc>
+          <w:tcPr>
+            <w:tcW w:type="dxa" w:w="6360"/>
+            <w:tcBorders>
+              <w:top w:val="single" w:color="BBBBBB" w:sz="1"/>
+              <w:left w:val="single" w:color="BBBBBB" w:sz="1"/>
+              <w:bottom w:val="single" w:color="BBBBBB" w:sz="1"/>
+              <w:right w:val="single" w:color="BBBBBB" w:sz="1"/>
+            </w:tcBorders>
+            <w:shd w:fill="1F3864" w:val="clear"/>
+            <w:tcMar>
+              <w:top w:type="dxa" w:w="60"/>
+              <w:left w:type="dxa" w:w="110"/>
+              <w:bottom w:type="dxa" w:w="60"/>
+              <w:right w:type="dxa" w:w="110"/>
+            </w:tcMar>
+            <w:vAlign w:val="center"/>
+          </w:tcPr>
+          <w:p>
+            <w:pPr>
+              <w:spacing w:after="0" w:line="276"/>
+              <w:jc w:val="center"/>
+            </w:pPr>
+            <w:r>
+              <w:rPr>
+                <w:rFonts w:ascii="Times New Roman" w:cs="Times New Roman" w:eastAsia="Times New Roman" w:hAnsi="Times New Roman"/>
+                <w:b/>
+                <w:bCs/>
+                <w:color w:val="FFFFFF"/>
+                <w:sz w:val="22"/>
+                <w:szCs w:val="22"/>
+              </w:rPr>
+              <w:t xml:space="preserve">Resultado</w:t>
+            </w:r>
+          </w:p>
+        </w:tc>
+      </w:tr>
+      <w:tr>
+        <w:tc>
+          <w:tcPr>
+            <w:tcW w:type="dxa" w:w="3000"/>
+            <w:tcBorders>
+              <w:top w:val="single" w:color="BBBBBB" w:sz="1"/>
+              <w:left w:val="single" w:color="BBBBBB" w:sz="1"/>
+              <w:bottom w:val="single" w:color="BBBBBB" w:sz="1"/>
+              <w:right w:val="single" w:color="BBBBBB" w:sz="1"/>
+            </w:tcBorders>
+            <w:shd w:fill="FFFFFF" w:val="clear"/>
+            <w:tcMar>
+              <w:top w:type="dxa" w:w="60"/>
+              <w:left w:type="dxa" w:w="110"/>
+              <w:bottom w:type="dxa" w:w="60"/>
+              <w:right w:type="dxa" w:w="110"/>
+            </w:tcMar>
+            <w:vAlign w:val="center"/>
+          </w:tcPr>
+          <w:p>
+            <w:pPr>
+              <w:spacing w:after="0" w:line="276"/>
+              <w:jc w:val="left"/>
+            </w:pPr>
+            <w:r>
+              <w:rPr>
+                <w:rFonts w:ascii="Times New Roman" w:cs="Times New Roman" w:eastAsia="Times New Roman" w:hAnsi="Times New Roman"/>
+                <w:b w:val="false"/>
+                <w:bCs w:val="false"/>
+                <w:color w:val="000000"/>
+                <w:sz w:val="21"/>
+                <w:szCs w:val="21"/>
+              </w:rPr>
+              <w:t xml:space="preserve">URL pública</w:t>
+            </w:r>
+          </w:p>
+        </w:tc>
+        <w:tc>
+          <w:tcPr>
+            <w:tcW w:type="dxa" w:w="6360"/>
+            <w:tcBorders>
+              <w:top w:val="single" w:color="BBBBBB" w:sz="1"/>
+              <w:left w:val="single" w:color="BBBBBB" w:sz="1"/>
+              <w:bottom w:val="single" w:color="BBBBBB" w:sz="1"/>
+              <w:right w:val="single" w:color="BBBBBB" w:sz="1"/>
+            </w:tcBorders>
+            <w:shd w:fill="FFFFFF" w:val="clear"/>
+            <w:tcMar>
+              <w:top w:type="dxa" w:w="60"/>
+              <w:left w:type="dxa" w:w="110"/>
+              <w:bottom w:type="dxa" w:w="60"/>
+              <w:right w:type="dxa" w:w="110"/>
+            </w:tcMar>
+            <w:vAlign w:val="center"/>
+          </w:tcPr>
+          <w:p>
+            <w:pPr>
+              <w:spacing w:after="0" w:line="276"/>
+              <w:jc w:val="left"/>
+            </w:pPr>
+            <w:r>
+              <w:rPr>
+                <w:rFonts w:ascii="Times New Roman" w:cs="Times New Roman" w:eastAsia="Times New Roman" w:hAnsi="Times New Roman"/>
+                <w:b w:val="false"/>
+                <w:bCs w:val="false"/>
+                <w:color w:val="000000"/>
+                <w:sz w:val="21"/>
+                <w:szCs w:val="21"/>
+              </w:rPr>
+              <w:t xml:space="preserve">https://agendapp-rde9.onrender.com</w:t>
+            </w:r>
+          </w:p>
+        </w:tc>
+      </w:tr>
+      <w:tr>
+        <w:tc>
+          <w:tcPr>
+            <w:tcW w:type="dxa" w:w="3000"/>
+            <w:tcBorders>
+              <w:top w:val="single" w:color="BBBBBB" w:sz="1"/>
+              <w:left w:val="single" w:color="BBBBBB" w:sz="1"/>
+              <w:bottom w:val="single" w:color="BBBBBB" w:sz="1"/>
+              <w:right w:val="single" w:color="BBBBBB" w:sz="1"/>
+            </w:tcBorders>
+            <w:shd w:fill="F2F5FB" w:val="clear"/>
+            <w:tcMar>
+              <w:top w:type="dxa" w:w="60"/>
+              <w:left w:type="dxa" w:w="110"/>
+              <w:bottom w:type="dxa" w:w="60"/>
+              <w:right w:type="dxa" w:w="110"/>
+            </w:tcMar>
+            <w:vAlign w:val="center"/>
+          </w:tcPr>
+          <w:p>
+            <w:pPr>
+              <w:spacing w:after="0" w:line="276"/>
+              <w:jc w:val="left"/>
+            </w:pPr>
+            <w:r>
+              <w:rPr>
+                <w:rFonts w:ascii="Times New Roman" w:cs="Times New Roman" w:eastAsia="Times New Roman" w:hAnsi="Times New Roman"/>
+                <w:b w:val="false"/>
+                <w:bCs w:val="false"/>
+                <w:color w:val="000000"/>
+                <w:sz w:val="21"/>
+                <w:szCs w:val="21"/>
+              </w:rPr>
+              <w:t xml:space="preserve">Repositorio de código</w:t>
+            </w:r>
+          </w:p>
+        </w:tc>
+        <w:tc>
+          <w:tcPr>
+            <w:tcW w:type="dxa" w:w="6360"/>
+            <w:tcBorders>
+              <w:top w:val="single" w:color="BBBBBB" w:sz="1"/>
+              <w:left w:val="single" w:color="BBBBBB" w:sz="1"/>
+              <w:bottom w:val="single" w:color="BBBBBB" w:sz="1"/>
+              <w:right w:val="single" w:color="BBBBBB" w:sz="1"/>
+            </w:tcBorders>
+            <w:shd w:fill="F2F5FB" w:val="clear"/>
+            <w:tcMar>
+              <w:top w:type="dxa" w:w="60"/>
+              <w:left w:type="dxa" w:w="110"/>
+              <w:bottom w:type="dxa" w:w="60"/>
+              <w:right w:type="dxa" w:w="110"/>
+            </w:tcMar>
+            <w:vAlign w:val="center"/>
+          </w:tcPr>
+          <w:p>
+            <w:pPr>
+              <w:spacing w:after="0" w:line="276"/>
+              <w:jc w:val="left"/>
+            </w:pPr>
+            <w:r>
+              <w:rPr>
+                <w:rFonts w:ascii="Times New Roman" w:cs="Times New Roman" w:eastAsia="Times New Roman" w:hAnsi="Times New Roman"/>
+                <w:b w:val="false"/>
+                <w:bCs w:val="false"/>
+                <w:color w:val="000000"/>
+                <w:sz w:val="21"/>
+                <w:szCs w:val="21"/>
+              </w:rPr>
+              <w:t xml:space="preserve">https://github.com/bgaleanotec-maker/agendapp</w:t>
+            </w:r>
+          </w:p>
+        </w:tc>
+      </w:tr>
+      <w:tr>
+        <w:tc>
+          <w:tcPr>
+            <w:tcW w:type="dxa" w:w="3000"/>
+            <w:tcBorders>
+              <w:top w:val="single" w:color="BBBBBB" w:sz="1"/>
+              <w:left w:val="single" w:color="BBBBBB" w:sz="1"/>
+              <w:bottom w:val="single" w:color="BBBBBB" w:sz="1"/>
+              <w:right w:val="single" w:color="BBBBBB" w:sz="1"/>
+            </w:tcBorders>
+            <w:shd w:fill="FFFFFF" w:val="clear"/>
+            <w:tcMar>
+              <w:top w:type="dxa" w:w="60"/>
+              <w:left w:type="dxa" w:w="110"/>
+              <w:bottom w:type="dxa" w:w="60"/>
+              <w:right w:type="dxa" w:w="110"/>
+            </w:tcMar>
+            <w:vAlign w:val="center"/>
+          </w:tcPr>
+          <w:p>
+            <w:pPr>
+              <w:spacing w:after="0" w:line="276"/>
+              <w:jc w:val="left"/>
+            </w:pPr>
+            <w:r>
+              <w:rPr>
+                <w:rFonts w:ascii="Times New Roman" w:cs="Times New Roman" w:eastAsia="Times New Roman" w:hAnsi="Times New Roman"/>
+                <w:b w:val="false"/>
+                <w:bCs w:val="false"/>
+                <w:color w:val="000000"/>
+                <w:sz w:val="21"/>
+                <w:szCs w:val="21"/>
+              </w:rPr>
+              <w:t xml:space="preserve">Plataforma / Servidor</w:t>
+            </w:r>
+          </w:p>
+        </w:tc>
+        <w:tc>
+          <w:tcPr>
+            <w:tcW w:type="dxa" w:w="6360"/>
+            <w:tcBorders>
+              <w:top w:val="single" w:color="BBBBBB" w:sz="1"/>
+              <w:left w:val="single" w:color="BBBBBB" w:sz="1"/>
+              <w:bottom w:val="single" w:color="BBBBBB" w:sz="1"/>
+              <w:right w:val="single" w:color="BBBBBB" w:sz="1"/>
+            </w:tcBorders>
+            <w:shd w:fill="FFFFFF" w:val="clear"/>
+            <w:tcMar>
+              <w:top w:type="dxa" w:w="60"/>
+              <w:left w:type="dxa" w:w="110"/>
+              <w:bottom w:type="dxa" w:w="60"/>
+              <w:right w:type="dxa" w:w="110"/>
+            </w:tcMar>
+            <w:vAlign w:val="center"/>
+          </w:tcPr>
+          <w:p>
+            <w:pPr>
+              <w:spacing w:after="0" w:line="276"/>
+              <w:jc w:val="left"/>
+            </w:pPr>
+            <w:r>
+              <w:rPr>
+                <w:rFonts w:ascii="Times New Roman" w:cs="Times New Roman" w:eastAsia="Times New Roman" w:hAnsi="Times New Roman"/>
+                <w:b w:val="false"/>
+                <w:bCs w:val="false"/>
+                <w:color w:val="000000"/>
+                <w:sz w:val="21"/>
+                <w:szCs w:val="21"/>
+              </w:rPr>
+              <w:t xml:space="preserve">Render · Gunicorn · PostgreSQL</w:t>
+            </w:r>
+          </w:p>
+        </w:tc>
+      </w:tr>
+      <w:tr>
+        <w:tc>
+          <w:tcPr>
+            <w:tcW w:type="dxa" w:w="3000"/>
+            <w:tcBorders>
+              <w:top w:val="single" w:color="BBBBBB" w:sz="1"/>
+              <w:left w:val="single" w:color="BBBBBB" w:sz="1"/>
+              <w:bottom w:val="single" w:color="BBBBBB" w:sz="1"/>
+              <w:right w:val="single" w:color="BBBBBB" w:sz="1"/>
+            </w:tcBorders>
+            <w:shd w:fill="F2F5FB" w:val="clear"/>
+            <w:tcMar>
+              <w:top w:type="dxa" w:w="60"/>
+              <w:left w:type="dxa" w:w="110"/>
+              <w:bottom w:type="dxa" w:w="60"/>
+              <w:right w:type="dxa" w:w="110"/>
+            </w:tcMar>
+            <w:vAlign w:val="center"/>
+          </w:tcPr>
+          <w:p>
+            <w:pPr>
+              <w:spacing w:after="0" w:line="276"/>
+              <w:jc w:val="left"/>
+            </w:pPr>
+            <w:r>
+              <w:rPr>
+                <w:rFonts w:ascii="Times New Roman" w:cs="Times New Roman" w:eastAsia="Times New Roman" w:hAnsi="Times New Roman"/>
+                <w:b w:val="false"/>
+                <w:bCs w:val="false"/>
+                <w:color w:val="000000"/>
+                <w:sz w:val="21"/>
+                <w:szCs w:val="21"/>
+              </w:rPr>
+              <w:t xml:space="preserve">Carga de datos</w:t>
+            </w:r>
+          </w:p>
+        </w:tc>
+        <w:tc>
+          <w:tcPr>
+            <w:tcW w:type="dxa" w:w="6360"/>
+            <w:tcBorders>
+              <w:top w:val="single" w:color="BBBBBB" w:sz="1"/>
+              <w:left w:val="single" w:color="BBBBBB" w:sz="1"/>
+              <w:bottom w:val="single" w:color="BBBBBB" w:sz="1"/>
+              <w:right w:val="single" w:color="BBBBBB" w:sz="1"/>
+            </w:tcBorders>
+            <w:shd w:fill="F2F5FB" w:val="clear"/>
+            <w:tcMar>
+              <w:top w:type="dxa" w:w="60"/>
+              <w:left w:type="dxa" w:w="110"/>
+              <w:bottom w:type="dxa" w:w="60"/>
+              <w:right w:type="dxa" w:w="110"/>
+            </w:tcMar>
+            <w:vAlign w:val="center"/>
+          </w:tcPr>
+          <w:p>
+            <w:pPr>
+              <w:spacing w:after="0" w:line="276"/>
+              <w:jc w:val="left"/>
+            </w:pPr>
+            <w:r>
+              <w:rPr>
+                <w:rFonts w:ascii="Times New Roman" w:cs="Times New Roman" w:eastAsia="Times New Roman" w:hAnsi="Times New Roman"/>
+                <w:b w:val="false"/>
+                <w:bCs w:val="false"/>
+                <w:color w:val="000000"/>
+                <w:sz w:val="21"/>
+                <w:szCs w:val="21"/>
+              </w:rPr>
+              <w:t xml:space="preserve">13 médicos y catálogo de citas visibles en la página de inicio</w:t>
+            </w:r>
+          </w:p>
+        </w:tc>
+      </w:tr>
+      <w:tr>
+        <w:tc>
+          <w:tcPr>
+            <w:tcW w:type="dxa" w:w="3000"/>
+            <w:tcBorders>
+              <w:top w:val="single" w:color="BBBBBB" w:sz="1"/>
+              <w:left w:val="single" w:color="BBBBBB" w:sz="1"/>
+              <w:bottom w:val="single" w:color="BBBBBB" w:sz="1"/>
+              <w:right w:val="single" w:color="BBBBBB" w:sz="1"/>
+            </w:tcBorders>
+            <w:shd w:fill="FFFFFF" w:val="clear"/>
+            <w:tcMar>
+              <w:top w:type="dxa" w:w="60"/>
+              <w:left w:type="dxa" w:w="110"/>
+              <w:bottom w:type="dxa" w:w="60"/>
+              <w:right w:type="dxa" w:w="110"/>
+            </w:tcMar>
+            <w:vAlign w:val="center"/>
+          </w:tcPr>
+          <w:p>
+            <w:pPr>
+              <w:spacing w:after="0" w:line="276"/>
+              <w:jc w:val="left"/>
+            </w:pPr>
+            <w:r>
+              <w:rPr>
+                <w:rFonts w:ascii="Times New Roman" w:cs="Times New Roman" w:eastAsia="Times New Roman" w:hAnsi="Times New Roman"/>
+                <w:b w:val="false"/>
+                <w:bCs w:val="false"/>
+                <w:color w:val="000000"/>
+                <w:sz w:val="21"/>
+                <w:szCs w:val="21"/>
+              </w:rPr>
+              <w:t xml:space="preserve">Inicio de sesión (médico)</w:t>
+            </w:r>
+          </w:p>
+        </w:tc>
+        <w:tc>
+          <w:tcPr>
+            <w:tcW w:type="dxa" w:w="6360"/>
+            <w:tcBorders>
+              <w:top w:val="single" w:color="BBBBBB" w:sz="1"/>
+              <w:left w:val="single" w:color="BBBBBB" w:sz="1"/>
+              <w:bottom w:val="single" w:color="BBBBBB" w:sz="1"/>
+              <w:right w:val="single" w:color="BBBBBB" w:sz="1"/>
+            </w:tcBorders>
+            <w:shd w:fill="FFFFFF" w:val="clear"/>
+            <w:tcMar>
+              <w:top w:type="dxa" w:w="60"/>
+              <w:left w:type="dxa" w:w="110"/>
+              <w:bottom w:type="dxa" w:w="60"/>
+              <w:right w:type="dxa" w:w="110"/>
+            </w:tcMar>
+            <w:vAlign w:val="center"/>
+          </w:tcPr>
+          <w:p>
+            <w:pPr>
+              <w:spacing w:after="0" w:line="276"/>
+              <w:jc w:val="left"/>
+            </w:pPr>
+            <w:r>
+              <w:rPr>
+                <w:rFonts w:ascii="Times New Roman" w:cs="Times New Roman" w:eastAsia="Times New Roman" w:hAnsi="Times New Roman"/>
+                <w:b w:val="false"/>
+                <w:bCs w:val="false"/>
+                <w:color w:val="000000"/>
+                <w:sz w:val="21"/>
+                <w:szCs w:val="21"/>
+              </w:rPr>
+              <w:t xml:space="preserve">Acceso exitoso y redirección al panel del médico</w:t>
+            </w:r>
+          </w:p>
+        </w:tc>
+      </w:tr>
+      <w:tr>
+        <w:tc>
+          <w:tcPr>
+            <w:tcW w:type="dxa" w:w="3000"/>
+            <w:tcBorders>
+              <w:top w:val="single" w:color="BBBBBB" w:sz="1"/>
+              <w:left w:val="single" w:color="BBBBBB" w:sz="1"/>
+              <w:bottom w:val="single" w:color="BBBBBB" w:sz="1"/>
+              <w:right w:val="single" w:color="BBBBBB" w:sz="1"/>
+            </w:tcBorders>
+            <w:shd w:fill="F2F5FB" w:val="clear"/>
+            <w:tcMar>
+              <w:top w:type="dxa" w:w="60"/>
+              <w:left w:type="dxa" w:w="110"/>
+              <w:bottom w:type="dxa" w:w="60"/>
+              <w:right w:type="dxa" w:w="110"/>
+            </w:tcMar>
+            <w:vAlign w:val="center"/>
+          </w:tcPr>
+          <w:p>
+            <w:pPr>
+              <w:spacing w:after="0" w:line="276"/>
+              <w:jc w:val="left"/>
+            </w:pPr>
+            <w:r>
+              <w:rPr>
+                <w:rFonts w:ascii="Times New Roman" w:cs="Times New Roman" w:eastAsia="Times New Roman" w:hAnsi="Times New Roman"/>
+                <w:b w:val="false"/>
+                <w:bCs w:val="false"/>
+                <w:color w:val="000000"/>
+                <w:sz w:val="21"/>
+                <w:szCs w:val="21"/>
+              </w:rPr>
+              <w:t xml:space="preserve">Control de acceso por rol</w:t>
+            </w:r>
+          </w:p>
+        </w:tc>
+        <w:tc>
+          <w:tcPr>
+            <w:tcW w:type="dxa" w:w="6360"/>
+            <w:tcBorders>
+              <w:top w:val="single" w:color="BBBBBB" w:sz="1"/>
+              <w:left w:val="single" w:color="BBBBBB" w:sz="1"/>
+              <w:bottom w:val="single" w:color="BBBBBB" w:sz="1"/>
+              <w:right w:val="single" w:color="BBBBBB" w:sz="1"/>
+            </w:tcBorders>
+            <w:shd w:fill="F2F5FB" w:val="clear"/>
+            <w:tcMar>
+              <w:top w:type="dxa" w:w="60"/>
+              <w:left w:type="dxa" w:w="110"/>
+              <w:bottom w:type="dxa" w:w="60"/>
+              <w:right w:type="dxa" w:w="110"/>
+            </w:tcMar>
+            <w:vAlign w:val="center"/>
+          </w:tcPr>
+          <w:p>
+            <w:pPr>
+              <w:spacing w:after="0" w:line="276"/>
+              <w:jc w:val="left"/>
+            </w:pPr>
+            <w:r>
+              <w:rPr>
+                <w:rFonts w:ascii="Times New Roman" w:cs="Times New Roman" w:eastAsia="Times New Roman" w:hAnsi="Times New Roman"/>
+                <w:b w:val="false"/>
+                <w:bCs w:val="false"/>
+                <w:color w:val="000000"/>
+                <w:sz w:val="21"/>
+                <w:szCs w:val="21"/>
+              </w:rPr>
+              <w:t xml:space="preserve">Cada usuario accede únicamente a las vistas de su rol</w:t>
+            </w:r>
+          </w:p>
+        </w:tc>
+      </w:tr>
+    </w:tbl>
+    <w:p>
+      <w:pPr>
+        <w:spacing w:after="120" w:line="360"/>
+        <w:jc w:val="both"/>
+      </w:pPr>
+      <w:r>
+        <w:rPr>
+          <w:rFonts w:ascii="Times New Roman" w:cs="Times New Roman" w:eastAsia="Times New Roman" w:hAnsi="Times New Roman"/>
+          <w:sz w:val="24"/>
+          <w:szCs w:val="24"/>
+        </w:rPr>
+        <w:t xml:space="preserve">Nota: el despliegue utiliza el plan gratuito de Render; tras un periodo de inactividad la primera solicitud puede tardar algunos segundos mientras el servicio se reactiva.</w:t>
       </w:r>
     </w:p>
     <w:sectPr>

</xml_diff>